<commit_message>
Klar gjorde til GUI og tilføjede tmp filer til gitignore
</commit_message>
<xml_diff>
--- a/Kravspec.docx
+++ b/Kravspec.docx
@@ -756,6 +756,95 @@
               <w:t>biblioteker anvendt</w:t>
             </w:r>
           </w:p>
+          <w:p>
+            <w:pPr>
+              <w:cnfStyle w:val="000000100000" w:firstRow="0" w:lastRow="0" w:firstColumn="0" w:lastColumn="0" w:oddVBand="0" w:evenVBand="0" w:oddHBand="1" w:evenHBand="0" w:firstRowFirstColumn="0" w:firstRowLastColumn="0" w:lastRowFirstColumn="0" w:lastRowLastColumn="0"/>
+              <w:rPr>
+                <w:i/>
+                <w:iCs/>
+              </w:rPr>
+            </w:pPr>
+            <w:r>
+              <w:rPr>
+                <w:i/>
+                <w:iCs/>
+              </w:rPr>
+              <w:t>Updated featurelist:</w:t>
+            </w:r>
+          </w:p>
+          <w:p>
+            <w:pPr>
+              <w:cnfStyle w:val="000000100000" w:firstRow="0" w:lastRow="0" w:firstColumn="0" w:lastColumn="0" w:oddVBand="0" w:evenVBand="0" w:oddHBand="1" w:evenHBand="0" w:firstRowFirstColumn="0" w:firstRowLastColumn="0" w:lastRowFirstColumn="0" w:lastRowLastColumn="0"/>
+            </w:pPr>
+            <w:r>
+              <w:t>Filer og destinationer:</w:t>
+            </w:r>
+          </w:p>
+          <w:p>
+            <w:pPr>
+              <w:pStyle w:val="ListParagraph"/>
+              <w:numPr>
+                <w:ilvl w:val="0"/>
+                <w:numId w:val="10"/>
+              </w:numPr>
+              <w:cnfStyle w:val="000000100000" w:firstRow="0" w:lastRow="0" w:firstColumn="0" w:lastColumn="0" w:oddVBand="0" w:evenVBand="0" w:oddHBand="1" w:evenHBand="0" w:firstRowFirstColumn="0" w:firstRowLastColumn="0" w:lastRowFirstColumn="0" w:lastRowLastColumn="0"/>
+            </w:pPr>
+            <w:r>
+              <w:t>Der skal kunne vælges hvilket excelark og hvilken kolonne der skal hentes link fra</w:t>
+            </w:r>
+          </w:p>
+          <w:p>
+            <w:pPr>
+              <w:pStyle w:val="ListParagraph"/>
+              <w:numPr>
+                <w:ilvl w:val="0"/>
+                <w:numId w:val="10"/>
+              </w:numPr>
+              <w:cnfStyle w:val="000000100000" w:firstRow="0" w:lastRow="0" w:firstColumn="0" w:lastColumn="0" w:oddVBand="0" w:evenVBand="0" w:oddHBand="1" w:evenHBand="0" w:firstRowFirstColumn="0" w:firstRowLastColumn="0" w:lastRowFirstColumn="0" w:lastRowLastColumn="0"/>
+            </w:pPr>
+            <w:r>
+              <w:t>Der skal kunne vælges hvilket excelark der skal noteres i, hvilke filer der er hentet</w:t>
+            </w:r>
+          </w:p>
+          <w:p>
+            <w:pPr>
+              <w:pStyle w:val="ListParagraph"/>
+              <w:numPr>
+                <w:ilvl w:val="0"/>
+                <w:numId w:val="10"/>
+              </w:numPr>
+              <w:cnfStyle w:val="000000100000" w:firstRow="0" w:lastRow="0" w:firstColumn="0" w:lastColumn="0" w:oddVBand="0" w:evenVBand="0" w:oddHBand="1" w:evenHBand="0" w:firstRowFirstColumn="0" w:firstRowLastColumn="0" w:lastRowFirstColumn="0" w:lastRowLastColumn="0"/>
+            </w:pPr>
+            <w:r>
+              <w:t xml:space="preserve">Der skal kunne vælges hvor de hentede filer skal gemmes. </w:t>
+            </w:r>
+          </w:p>
+          <w:p>
+            <w:pPr>
+              <w:pStyle w:val="ListParagraph"/>
+              <w:numPr>
+                <w:ilvl w:val="0"/>
+                <w:numId w:val="10"/>
+              </w:numPr>
+              <w:cnfStyle w:val="000000100000" w:firstRow="0" w:lastRow="0" w:firstColumn="0" w:lastColumn="0" w:oddVBand="0" w:evenVBand="0" w:oddHBand="1" w:evenHBand="0" w:firstRowFirstColumn="0" w:firstRowLastColumn="0" w:lastRowFirstColumn="0" w:lastRowLastColumn="0"/>
+            </w:pPr>
+            <w:r>
+              <w:t>Der skal kunne vælges om der skal forsøges at hente alle pdf’er eller kun dem der ikke før er forsøgt</w:t>
+            </w:r>
+          </w:p>
+          <w:p>
+            <w:pPr>
+              <w:pStyle w:val="ListParagraph"/>
+              <w:numPr>
+                <w:ilvl w:val="0"/>
+                <w:numId w:val="10"/>
+              </w:numPr>
+              <w:cnfStyle w:val="000000100000" w:firstRow="0" w:lastRow="0" w:firstColumn="0" w:lastColumn="0" w:oddVBand="0" w:evenVBand="0" w:oddHBand="1" w:evenHBand="0" w:firstRowFirstColumn="0" w:firstRowLastColumn="0" w:lastRowFirstColumn="0" w:lastRowLastColumn="0"/>
+            </w:pPr>
+            <w:r>
+              <w:t>Der skal inkobereres at der bliver tjekket om filerne er hentet men ikke lagt i excelarket</w:t>
+            </w:r>
+          </w:p>
         </w:tc>
       </w:tr>
       <w:tr>
@@ -1739,6 +1828,9 @@
             <w:pPr>
               <w:cnfStyle w:val="000000000000" w:firstRow="0" w:lastRow="0" w:firstColumn="0" w:lastColumn="0" w:oddVBand="0" w:evenVBand="0" w:oddHBand="0" w:evenHBand="0" w:firstRowFirstColumn="0" w:firstRowLastColumn="0" w:lastRowFirstColumn="0" w:lastRowLastColumn="0"/>
             </w:pPr>
+            <w:r>
+              <w:t>Der skal sættes en front end up</w:t>
+            </w:r>
           </w:p>
         </w:tc>
         <w:tc>
@@ -1756,6 +1848,9 @@
             <w:pPr>
               <w:cnfStyle w:val="000000000000" w:firstRow="0" w:lastRow="0" w:firstColumn="0" w:lastColumn="0" w:oddVBand="0" w:evenVBand="0" w:oddHBand="0" w:evenHBand="0" w:firstRowFirstColumn="0" w:firstRowLastColumn="0" w:lastRowFirstColumn="0" w:lastRowLastColumn="0"/>
             </w:pPr>
+            <w:r>
+              <w:t>26/2</w:t>
+            </w:r>
           </w:p>
         </w:tc>
         <w:tc>
@@ -1789,6 +1884,90 @@
           <w:p>
             <w:pPr>
               <w:cnfStyle w:val="000000000000" w:firstRow="0" w:lastRow="0" w:firstColumn="0" w:lastColumn="0" w:oddVBand="0" w:evenVBand="0" w:oddHBand="0" w:evenHBand="0" w:firstRowFirstColumn="0" w:firstRowLastColumn="0" w:lastRowFirstColumn="0" w:lastRowLastColumn="0"/>
+            </w:pPr>
+          </w:p>
+        </w:tc>
+      </w:tr>
+      <w:tr>
+        <w:trPr>
+          <w:cnfStyle w:val="000000100000" w:firstRow="0" w:lastRow="0" w:firstColumn="0" w:lastColumn="0" w:oddVBand="0" w:evenVBand="0" w:oddHBand="1" w:evenHBand="0" w:firstRowFirstColumn="0" w:firstRowLastColumn="0" w:lastRowFirstColumn="0" w:lastRowLastColumn="0"/>
+          <w:trHeight w:val="1233"/>
+        </w:trPr>
+        <w:tc>
+          <w:tcPr>
+            <w:cnfStyle w:val="001000000000" w:firstRow="0" w:lastRow="0" w:firstColumn="1" w:lastColumn="0" w:oddVBand="0" w:evenVBand="0" w:oddHBand="0" w:evenHBand="0" w:firstRowFirstColumn="0" w:firstRowLastColumn="0" w:lastRowFirstColumn="0" w:lastRowLastColumn="0"/>
+            <w:tcW w:w="1704" w:type="dxa"/>
+          </w:tcPr>
+          <w:p/>
+        </w:tc>
+        <w:tc>
+          <w:tcPr>
+            <w:tcW w:w="2991" w:type="dxa"/>
+            <w:tcBorders>
+              <w:top w:val="single" w:sz="12" w:space="0" w:color="000000" w:themeColor="text1"/>
+              <w:left w:val="single" w:sz="12" w:space="0" w:color="000000" w:themeColor="text1"/>
+              <w:bottom w:val="single" w:sz="12" w:space="0" w:color="000000" w:themeColor="text1"/>
+              <w:right w:val="single" w:sz="4" w:space="0" w:color="000000" w:themeColor="text1"/>
+            </w:tcBorders>
+            <w:vAlign w:val="center"/>
+          </w:tcPr>
+          <w:p>
+            <w:pPr>
+              <w:cnfStyle w:val="000000100000" w:firstRow="0" w:lastRow="0" w:firstColumn="0" w:lastColumn="0" w:oddVBand="0" w:evenVBand="0" w:oddHBand="1" w:evenHBand="0" w:firstRowFirstColumn="0" w:firstRowLastColumn="0" w:lastRowFirstColumn="0" w:lastRowLastColumn="0"/>
+            </w:pPr>
+            <w:r>
+              <w:t>Der skal laves en knap til at downloade pdf’er</w:t>
+            </w:r>
+          </w:p>
+        </w:tc>
+        <w:tc>
+          <w:tcPr>
+            <w:tcW w:w="1254" w:type="dxa"/>
+            <w:tcBorders>
+              <w:top w:val="single" w:sz="12" w:space="0" w:color="000000" w:themeColor="text1"/>
+              <w:left w:val="single" w:sz="4" w:space="0" w:color="000000" w:themeColor="text1"/>
+              <w:bottom w:val="single" w:sz="12" w:space="0" w:color="000000" w:themeColor="text1"/>
+              <w:right w:val="single" w:sz="4" w:space="0" w:color="000000" w:themeColor="text1"/>
+            </w:tcBorders>
+            <w:vAlign w:val="center"/>
+          </w:tcPr>
+          <w:p>
+            <w:pPr>
+              <w:cnfStyle w:val="000000100000" w:firstRow="0" w:lastRow="0" w:firstColumn="0" w:lastColumn="0" w:oddVBand="0" w:evenVBand="0" w:oddHBand="1" w:evenHBand="0" w:firstRowFirstColumn="0" w:firstRowLastColumn="0" w:lastRowFirstColumn="0" w:lastRowLastColumn="0"/>
+            </w:pPr>
+          </w:p>
+        </w:tc>
+        <w:tc>
+          <w:tcPr>
+            <w:tcW w:w="1731" w:type="dxa"/>
+            <w:tcBorders>
+              <w:top w:val="single" w:sz="12" w:space="0" w:color="000000" w:themeColor="text1"/>
+              <w:left w:val="single" w:sz="4" w:space="0" w:color="000000" w:themeColor="text1"/>
+              <w:bottom w:val="single" w:sz="12" w:space="0" w:color="000000" w:themeColor="text1"/>
+              <w:right w:val="single" w:sz="4" w:space="0" w:color="000000" w:themeColor="text1"/>
+            </w:tcBorders>
+            <w:vAlign w:val="center"/>
+          </w:tcPr>
+          <w:p>
+            <w:pPr>
+              <w:cnfStyle w:val="000000100000" w:firstRow="0" w:lastRow="0" w:firstColumn="0" w:lastColumn="0" w:oddVBand="0" w:evenVBand="0" w:oddHBand="1" w:evenHBand="0" w:firstRowFirstColumn="0" w:firstRowLastColumn="0" w:lastRowFirstColumn="0" w:lastRowLastColumn="0"/>
+            </w:pPr>
+          </w:p>
+        </w:tc>
+        <w:tc>
+          <w:tcPr>
+            <w:tcW w:w="1993" w:type="dxa"/>
+            <w:tcBorders>
+              <w:top w:val="single" w:sz="12" w:space="0" w:color="000000" w:themeColor="text1"/>
+              <w:left w:val="single" w:sz="4" w:space="0" w:color="000000" w:themeColor="text1"/>
+              <w:bottom w:val="single" w:sz="12" w:space="0" w:color="000000" w:themeColor="text1"/>
+              <w:right w:val="single" w:sz="12" w:space="0" w:color="000000" w:themeColor="text1"/>
+            </w:tcBorders>
+            <w:vAlign w:val="center"/>
+          </w:tcPr>
+          <w:p>
+            <w:pPr>
+              <w:cnfStyle w:val="000000100000" w:firstRow="0" w:lastRow="0" w:firstColumn="0" w:lastColumn="0" w:oddVBand="0" w:evenVBand="0" w:oddHBand="1" w:evenHBand="0" w:firstRowFirstColumn="0" w:firstRowLastColumn="0" w:lastRowFirstColumn="0" w:lastRowLastColumn="0"/>
             </w:pPr>
           </w:p>
         </w:tc>
@@ -1912,6 +2091,9 @@
       </w:rPr>
     </w:pPr>
     <w:r>
+      <w:rPr>
+        <w:noProof/>
+      </w:rPr>
       <w:drawing>
         <wp:inline distT="0" distB="0" distL="0" distR="0" wp14:anchorId="0E5ACAC0" wp14:editId="4C20CF3D">
           <wp:extent cx="2233930" cy="481183"/>
@@ -2130,6 +2312,119 @@
     </w:lvl>
   </w:abstractNum>
   <w:abstractNum w:abstractNumId="1" w15:restartNumberingAfterBreak="0">
+    <w:nsid w:val="08490D0D"/>
+    <w:multiLevelType w:val="hybridMultilevel"/>
+    <w:tmpl w:val="5AB07E6E"/>
+    <w:lvl w:ilvl="0" w:tplc="20000003">
+      <w:start w:val="1"/>
+      <w:numFmt w:val="bullet"/>
+      <w:lvlText w:val="o"/>
+      <w:lvlJc w:val="left"/>
+      <w:pPr>
+        <w:ind w:left="720" w:hanging="360"/>
+      </w:pPr>
+      <w:rPr>
+        <w:rFonts w:ascii="Courier New" w:hAnsi="Courier New" w:cs="Courier New" w:hint="default"/>
+      </w:rPr>
+    </w:lvl>
+    <w:lvl w:ilvl="1" w:tplc="20000003" w:tentative="1">
+      <w:start w:val="1"/>
+      <w:numFmt w:val="bullet"/>
+      <w:lvlText w:val="o"/>
+      <w:lvlJc w:val="left"/>
+      <w:pPr>
+        <w:ind w:left="1440" w:hanging="360"/>
+      </w:pPr>
+      <w:rPr>
+        <w:rFonts w:ascii="Courier New" w:hAnsi="Courier New" w:cs="Courier New" w:hint="default"/>
+      </w:rPr>
+    </w:lvl>
+    <w:lvl w:ilvl="2" w:tplc="20000005" w:tentative="1">
+      <w:start w:val="1"/>
+      <w:numFmt w:val="bullet"/>
+      <w:lvlText w:val=""/>
+      <w:lvlJc w:val="left"/>
+      <w:pPr>
+        <w:ind w:left="2160" w:hanging="360"/>
+      </w:pPr>
+      <w:rPr>
+        <w:rFonts w:ascii="Wingdings" w:hAnsi="Wingdings" w:hint="default"/>
+      </w:rPr>
+    </w:lvl>
+    <w:lvl w:ilvl="3" w:tplc="20000001" w:tentative="1">
+      <w:start w:val="1"/>
+      <w:numFmt w:val="bullet"/>
+      <w:lvlText w:val=""/>
+      <w:lvlJc w:val="left"/>
+      <w:pPr>
+        <w:ind w:left="2880" w:hanging="360"/>
+      </w:pPr>
+      <w:rPr>
+        <w:rFonts w:ascii="Symbol" w:hAnsi="Symbol" w:hint="default"/>
+      </w:rPr>
+    </w:lvl>
+    <w:lvl w:ilvl="4" w:tplc="20000003" w:tentative="1">
+      <w:start w:val="1"/>
+      <w:numFmt w:val="bullet"/>
+      <w:lvlText w:val="o"/>
+      <w:lvlJc w:val="left"/>
+      <w:pPr>
+        <w:ind w:left="3600" w:hanging="360"/>
+      </w:pPr>
+      <w:rPr>
+        <w:rFonts w:ascii="Courier New" w:hAnsi="Courier New" w:cs="Courier New" w:hint="default"/>
+      </w:rPr>
+    </w:lvl>
+    <w:lvl w:ilvl="5" w:tplc="20000005" w:tentative="1">
+      <w:start w:val="1"/>
+      <w:numFmt w:val="bullet"/>
+      <w:lvlText w:val=""/>
+      <w:lvlJc w:val="left"/>
+      <w:pPr>
+        <w:ind w:left="4320" w:hanging="360"/>
+      </w:pPr>
+      <w:rPr>
+        <w:rFonts w:ascii="Wingdings" w:hAnsi="Wingdings" w:hint="default"/>
+      </w:rPr>
+    </w:lvl>
+    <w:lvl w:ilvl="6" w:tplc="20000001" w:tentative="1">
+      <w:start w:val="1"/>
+      <w:numFmt w:val="bullet"/>
+      <w:lvlText w:val=""/>
+      <w:lvlJc w:val="left"/>
+      <w:pPr>
+        <w:ind w:left="5040" w:hanging="360"/>
+      </w:pPr>
+      <w:rPr>
+        <w:rFonts w:ascii="Symbol" w:hAnsi="Symbol" w:hint="default"/>
+      </w:rPr>
+    </w:lvl>
+    <w:lvl w:ilvl="7" w:tplc="20000003" w:tentative="1">
+      <w:start w:val="1"/>
+      <w:numFmt w:val="bullet"/>
+      <w:lvlText w:val="o"/>
+      <w:lvlJc w:val="left"/>
+      <w:pPr>
+        <w:ind w:left="5760" w:hanging="360"/>
+      </w:pPr>
+      <w:rPr>
+        <w:rFonts w:ascii="Courier New" w:hAnsi="Courier New" w:cs="Courier New" w:hint="default"/>
+      </w:rPr>
+    </w:lvl>
+    <w:lvl w:ilvl="8" w:tplc="20000005" w:tentative="1">
+      <w:start w:val="1"/>
+      <w:numFmt w:val="bullet"/>
+      <w:lvlText w:val=""/>
+      <w:lvlJc w:val="left"/>
+      <w:pPr>
+        <w:ind w:left="6480" w:hanging="360"/>
+      </w:pPr>
+      <w:rPr>
+        <w:rFonts w:ascii="Wingdings" w:hAnsi="Wingdings" w:hint="default"/>
+      </w:rPr>
+    </w:lvl>
+  </w:abstractNum>
+  <w:abstractNum w:abstractNumId="2" w15:restartNumberingAfterBreak="0">
     <w:nsid w:val="0D4244D4"/>
     <w:multiLevelType w:val="hybridMultilevel"/>
     <w:tmpl w:val="7BDE512E"/>
@@ -2242,7 +2537,7 @@
       </w:rPr>
     </w:lvl>
   </w:abstractNum>
-  <w:abstractNum w:abstractNumId="2" w15:restartNumberingAfterBreak="0">
+  <w:abstractNum w:abstractNumId="3" w15:restartNumberingAfterBreak="0">
     <w:nsid w:val="11801762"/>
     <w:multiLevelType w:val="hybridMultilevel"/>
     <w:tmpl w:val="72DCECF8"/>
@@ -2355,7 +2650,7 @@
       </w:rPr>
     </w:lvl>
   </w:abstractNum>
-  <w:abstractNum w:abstractNumId="3" w15:restartNumberingAfterBreak="0">
+  <w:abstractNum w:abstractNumId="4" w15:restartNumberingAfterBreak="0">
     <w:nsid w:val="287953F0"/>
     <w:multiLevelType w:val="hybridMultilevel"/>
     <w:tmpl w:val="A77E12BE"/>
@@ -2468,7 +2763,7 @@
       </w:rPr>
     </w:lvl>
   </w:abstractNum>
-  <w:abstractNum w:abstractNumId="4" w15:restartNumberingAfterBreak="0">
+  <w:abstractNum w:abstractNumId="5" w15:restartNumberingAfterBreak="0">
     <w:nsid w:val="2F1619A4"/>
     <w:multiLevelType w:val="hybridMultilevel"/>
     <w:tmpl w:val="C9CC39C0"/>
@@ -2581,7 +2876,7 @@
       </w:rPr>
     </w:lvl>
   </w:abstractNum>
-  <w:abstractNum w:abstractNumId="5" w15:restartNumberingAfterBreak="0">
+  <w:abstractNum w:abstractNumId="6" w15:restartNumberingAfterBreak="0">
     <w:nsid w:val="435314DD"/>
     <w:multiLevelType w:val="hybridMultilevel"/>
     <w:tmpl w:val="18385D2E"/>
@@ -2694,7 +2989,7 @@
       </w:rPr>
     </w:lvl>
   </w:abstractNum>
-  <w:abstractNum w:abstractNumId="6" w15:restartNumberingAfterBreak="0">
+  <w:abstractNum w:abstractNumId="7" w15:restartNumberingAfterBreak="0">
     <w:nsid w:val="4A920B61"/>
     <w:multiLevelType w:val="multilevel"/>
     <w:tmpl w:val="6016B66C"/>
@@ -2843,7 +3138,7 @@
       </w:rPr>
     </w:lvl>
   </w:abstractNum>
-  <w:abstractNum w:abstractNumId="7" w15:restartNumberingAfterBreak="0">
+  <w:abstractNum w:abstractNumId="8" w15:restartNumberingAfterBreak="0">
     <w:nsid w:val="51434656"/>
     <w:multiLevelType w:val="hybridMultilevel"/>
     <w:tmpl w:val="112416F8"/>
@@ -2956,7 +3251,7 @@
       </w:rPr>
     </w:lvl>
   </w:abstractNum>
-  <w:abstractNum w:abstractNumId="8" w15:restartNumberingAfterBreak="0">
+  <w:abstractNum w:abstractNumId="9" w15:restartNumberingAfterBreak="0">
     <w:nsid w:val="75470202"/>
     <w:multiLevelType w:val="multilevel"/>
     <w:tmpl w:val="54862114"/>
@@ -3106,31 +3401,34 @@
     </w:lvl>
   </w:abstractNum>
   <w:num w:numId="1" w16cid:durableId="145364718">
+    <w:abstractNumId w:val="8"/>
+  </w:num>
+  <w:num w:numId="2" w16cid:durableId="2077319055">
+    <w:abstractNumId w:val="2"/>
+  </w:num>
+  <w:num w:numId="3" w16cid:durableId="1884320538">
     <w:abstractNumId w:val="7"/>
   </w:num>
-  <w:num w:numId="2" w16cid:durableId="2077319055">
-    <w:abstractNumId w:val="1"/>
-  </w:num>
-  <w:num w:numId="3" w16cid:durableId="1884320538">
-    <w:abstractNumId w:val="6"/>
-  </w:num>
   <w:num w:numId="4" w16cid:durableId="518856553">
-    <w:abstractNumId w:val="8"/>
+    <w:abstractNumId w:val="9"/>
   </w:num>
   <w:num w:numId="5" w16cid:durableId="1910991509">
+    <w:abstractNumId w:val="5"/>
+  </w:num>
+  <w:num w:numId="6" w16cid:durableId="991909667">
     <w:abstractNumId w:val="4"/>
   </w:num>
-  <w:num w:numId="6" w16cid:durableId="991909667">
+  <w:num w:numId="7" w16cid:durableId="663440465">
     <w:abstractNumId w:val="3"/>
-  </w:num>
-  <w:num w:numId="7" w16cid:durableId="663440465">
-    <w:abstractNumId w:val="2"/>
   </w:num>
   <w:num w:numId="8" w16cid:durableId="119812048">
     <w:abstractNumId w:val="0"/>
   </w:num>
   <w:num w:numId="9" w16cid:durableId="1972856987">
-    <w:abstractNumId w:val="5"/>
+    <w:abstractNumId w:val="6"/>
+  </w:num>
+  <w:num w:numId="10" w16cid:durableId="1008218001">
+    <w:abstractNumId w:val="1"/>
   </w:num>
 </w:numbering>
 </file>
@@ -4686,6 +4984,15 @@
 </file>
 
 <file path=customXml/item1.xml><?xml version="1.0" encoding="utf-8"?>
+<?mso-contentType ?>
+<FormTemplates xmlns="http://schemas.microsoft.com/sharepoint/v3/contenttype/forms">
+  <Display>DocumentLibraryForm</Display>
+  <Edit>DocumentLibraryForm</Edit>
+  <New>DocumentLibraryForm</New>
+</FormTemplates>
+</file>
+
+<file path=customXml/item2.xml><?xml version="1.0" encoding="utf-8"?>
 <p:properties xmlns:p="http://schemas.microsoft.com/office/2006/metadata/properties" xmlns:xsi="http://www.w3.org/2001/XMLSchema-instance" xmlns:pc="http://schemas.microsoft.com/office/infopath/2007/PartnerControls">
   <documentManagement>
     <lcf76f155ced4ddcb4097134ff3c332f xmlns="4b06a6df-1172-4cb5-860a-26c343ad0bd0">
@@ -4696,20 +5003,7 @@
 </p:properties>
 </file>
 
-<file path=customXml/item2.xml><?xml version="1.0" encoding="utf-8"?>
-<?mso-contentType ?>
-<FormTemplates xmlns="http://schemas.microsoft.com/sharepoint/v3/contenttype/forms">
-  <Display>DocumentLibraryForm</Display>
-  <Edit>DocumentLibraryForm</Edit>
-  <New>DocumentLibraryForm</New>
-</FormTemplates>
-</file>
-
 <file path=customXml/item3.xml><?xml version="1.0" encoding="utf-8"?>
-<b:Sources xmlns:b="http://schemas.openxmlformats.org/officeDocument/2006/bibliography" xmlns="http://schemas.openxmlformats.org/officeDocument/2006/bibliography" SelectedStyle="\APASixthEditionOfficeOnline.xsl" StyleName="APA" Version="6"/>
-</file>
-
-<file path=customXml/item4.xml><?xml version="1.0" encoding="utf-8"?>
 <ct:contentTypeSchema xmlns:ct="http://schemas.microsoft.com/office/2006/metadata/contentType" xmlns:ma="http://schemas.microsoft.com/office/2006/metadata/properties/metaAttributes" ct:_="" ma:_="" ma:contentTypeName="Dokument" ma:contentTypeID="0x010100083CE9A8211A2049BB1C556D11DC5EFF" ma:contentTypeVersion="9" ma:contentTypeDescription="Opret et nyt dokument." ma:contentTypeScope="" ma:versionID="351799631085af1d645f8387e8d3c28e">
   <xsd:schema xmlns:xsd="http://www.w3.org/2001/XMLSchema" xmlns:xs="http://www.w3.org/2001/XMLSchema" xmlns:p="http://schemas.microsoft.com/office/2006/metadata/properties" xmlns:ns2="4b06a6df-1172-4cb5-860a-26c343ad0bd0" xmlns:ns3="44551836-b562-4a63-baf9-3ddf9d7e0143" targetNamespace="http://schemas.microsoft.com/office/2006/metadata/properties" ma:root="true" ma:fieldsID="1ad0bd10ce320e3fcd346d69deaabb73" ns2:_="" ns3:_="">
     <xsd:import namespace="4b06a6df-1172-4cb5-860a-26c343ad0bd0"/>
@@ -4890,7 +5184,19 @@
 </ct:contentTypeSchema>
 </file>
 
+<file path=customXml/item4.xml><?xml version="1.0" encoding="utf-8"?>
+<b:Sources xmlns:b="http://schemas.openxmlformats.org/officeDocument/2006/bibliography" xmlns="http://schemas.openxmlformats.org/officeDocument/2006/bibliography" SelectedStyle="\APASixthEditionOfficeOnline.xsl" StyleName="APA" Version="6"/>
+</file>
+
 <file path=customXml/itemProps1.xml><?xml version="1.0" encoding="utf-8"?>
+<ds:datastoreItem xmlns:ds="http://schemas.openxmlformats.org/officeDocument/2006/customXml" ds:itemID="{CA81598C-1512-4F5F-A422-047E9777DB10}">
+  <ds:schemaRefs>
+    <ds:schemaRef ds:uri="http://schemas.microsoft.com/sharepoint/v3/contenttype/forms"/>
+  </ds:schemaRefs>
+</ds:datastoreItem>
+</file>
+
+<file path=customXml/itemProps2.xml><?xml version="1.0" encoding="utf-8"?>
 <ds:datastoreItem xmlns:ds="http://schemas.openxmlformats.org/officeDocument/2006/customXml" ds:itemID="{1757556D-872F-447F-8A54-A8F5DE21737C}">
   <ds:schemaRefs>
     <ds:schemaRef ds:uri="http://schemas.microsoft.com/office/2006/metadata/properties"/>
@@ -4901,23 +5207,7 @@
 </ds:datastoreItem>
 </file>
 
-<file path=customXml/itemProps2.xml><?xml version="1.0" encoding="utf-8"?>
-<ds:datastoreItem xmlns:ds="http://schemas.openxmlformats.org/officeDocument/2006/customXml" ds:itemID="{CA81598C-1512-4F5F-A422-047E9777DB10}">
-  <ds:schemaRefs>
-    <ds:schemaRef ds:uri="http://schemas.microsoft.com/sharepoint/v3/contenttype/forms"/>
-  </ds:schemaRefs>
-</ds:datastoreItem>
-</file>
-
 <file path=customXml/itemProps3.xml><?xml version="1.0" encoding="utf-8"?>
-<ds:datastoreItem xmlns:ds="http://schemas.openxmlformats.org/officeDocument/2006/customXml" ds:itemID="{7924A1FF-A1E1-4F9A-AD6D-8183F67B2F7D}">
-  <ds:schemaRefs>
-    <ds:schemaRef ds:uri="http://schemas.openxmlformats.org/officeDocument/2006/bibliography"/>
-  </ds:schemaRefs>
-</ds:datastoreItem>
-</file>
-
-<file path=customXml/itemProps4.xml><?xml version="1.0" encoding="utf-8"?>
 <ds:datastoreItem xmlns:ds="http://schemas.openxmlformats.org/officeDocument/2006/customXml" ds:itemID="{FD92B04E-A6A0-4FF3-9C19-A3215930429B}">
   <ds:schemaRefs>
     <ds:schemaRef ds:uri="http://schemas.microsoft.com/office/2006/metadata/contentType"/>
@@ -4934,4 +5224,12 @@
     <ds:schemaRef ds:uri="http://schemas.microsoft.com/internal/obd"/>
   </ds:schemaRefs>
 </ds:datastoreItem>
+</file>
+
+<file path=customXml/itemProps4.xml><?xml version="1.0" encoding="utf-8"?>
+<ds:datastoreItem xmlns:ds="http://schemas.openxmlformats.org/officeDocument/2006/customXml" ds:itemID="{7924A1FF-A1E1-4F9A-AD6D-8183F67B2F7D}">
+  <ds:schemaRefs>
+    <ds:schemaRef ds:uri="http://schemas.openxmlformats.org/officeDocument/2006/bibliography"/>
+  </ds:schemaRefs>
+</ds:datastoreItem>
 </file>
</xml_diff>